<commit_message>
Poner integrantes del amigo y quitar columnas de correo y teléfono
Co-Authored-By: Claude Opus 5.5 <noreply@anthropic.com>
Claude-Session: https://claude.ai/code/session_01MPxHATC7J23odgNHR4pRGu
</commit_message>
<xml_diff>
--- a/Portada_Amigo_Delimitada.docx
+++ b/Portada_Amigo_Delimitada.docx
@@ -419,15 +419,13 @@
     </w:p>
     <w:tbl>
       <w:tblPr>
-        <w:tblW w:w="9406" w:type="dxa"/>
+        <w:tblW w:w="7200" w:type="dxa"/>
         <w:jc w:val="center"/>
         <w:tblLook w:val="04A0" w:firstRow="1" w:lastRow="0" w:firstColumn="1" w:lastColumn="0" w:noHBand="0" w:noVBand="1"/>
       </w:tblPr>
       <w:tblGrid>
-        <w:gridCol w:w="1249"/>
-        <w:gridCol w:w="4183"/>
-        <w:gridCol w:w="2591"/>
-        <w:gridCol w:w="1383"/>
+        <w:gridCol w:w="1800"/>
+        <w:gridCol w:w="5400"/>
       </w:tblGrid>
       <w:tr>
         <w:trPr>
@@ -508,11 +506,50 @@
             </w:r>
           </w:p>
         </w:tc>
+      </w:tr>
+      <w:tr>
+        <w:trPr>
+          <w:trHeight w:val="353"/>
+          <w:jc w:val="center"/>
+        </w:trPr>
         <w:tc>
           <w:tcPr>
             <w:tcW w:w="0" w:type="auto"/>
             <w:tcBorders>
-              <w:top w:val="single" w:sz="4" w:space="0" w:color="auto"/>
+              <w:top w:val="nil"/>
+              <w:left w:val="single" w:sz="4" w:space="0" w:color="auto"/>
+              <w:bottom w:val="single" w:sz="4" w:space="0" w:color="auto"/>
+              <w:right w:val="single" w:sz="4" w:space="0" w:color="auto"/>
+            </w:tcBorders>
+            <w:noWrap/>
+            <w:vAlign w:val="bottom"/>
+            <w:hideMark/>
+          </w:tcPr>
+          <w:p>
+            <w:pPr>
+              <w:spacing w:after="0" w:line="360" w:lineRule="auto"/>
+              <w:jc w:val="left"/>
+              <w:rPr>
+                <w:rFonts w:eastAsia="Times New Roman" w:cs="Arial"/>
+                <w:color w:val="000000"/>
+                <w:szCs w:val="24"/>
+              </w:rPr>
+            </w:pPr>
+            <w:r>
+              <w:rPr>
+                <w:rFonts w:eastAsia="Times New Roman" w:cs="Arial"/>
+                <w:color w:val="000000"/>
+                <w:szCs w:val="24"/>
+              </w:rPr>
+              <w:t>MS19039</w:t>
+            </w:r>
+          </w:p>
+        </w:tc>
+        <w:tc>
+          <w:tcPr>
+            <w:tcW w:w="0" w:type="auto"/>
+            <w:tcBorders>
+              <w:top w:val="nil"/>
               <w:left w:val="nil"/>
               <w:bottom w:val="single" w:sz="4" w:space="0" w:color="auto"/>
               <w:right w:val="single" w:sz="4" w:space="0" w:color="auto"/>
@@ -527,8 +564,6 @@
               <w:jc w:val="left"/>
               <w:rPr>
                 <w:rFonts w:eastAsia="Times New Roman" w:cs="Arial"/>
-                <w:b/>
-                <w:bCs/>
                 <w:color w:val="000000"/>
                 <w:szCs w:val="24"/>
               </w:rPr>
@@ -536,49 +571,10 @@
             <w:r>
               <w:rPr>
                 <w:rFonts w:eastAsia="Times New Roman" w:cs="Arial"/>
-                <w:b/>
-                <w:bCs/>
                 <w:color w:val="000000"/>
                 <w:szCs w:val="24"/>
               </w:rPr>
-              <w:t>Correo</w:t>
-            </w:r>
-          </w:p>
-        </w:tc>
-        <w:tc>
-          <w:tcPr>
-            <w:tcW w:w="0" w:type="auto"/>
-            <w:tcBorders>
-              <w:top w:val="single" w:sz="4" w:space="0" w:color="auto"/>
-              <w:left w:val="nil"/>
-              <w:bottom w:val="single" w:sz="4" w:space="0" w:color="auto"/>
-              <w:right w:val="single" w:sz="4" w:space="0" w:color="auto"/>
-            </w:tcBorders>
-            <w:noWrap/>
-            <w:vAlign w:val="bottom"/>
-            <w:hideMark/>
-          </w:tcPr>
-          <w:p>
-            <w:pPr>
-              <w:spacing w:after="0" w:line="360" w:lineRule="auto"/>
-              <w:jc w:val="left"/>
-              <w:rPr>
-                <w:rFonts w:eastAsia="Times New Roman" w:cs="Arial"/>
-                <w:b/>
-                <w:bCs/>
-                <w:color w:val="000000"/>
-                <w:szCs w:val="24"/>
-              </w:rPr>
-            </w:pPr>
-            <w:r>
-              <w:rPr>
-                <w:rFonts w:eastAsia="Times New Roman" w:cs="Arial"/>
-                <w:b/>
-                <w:bCs/>
-                <w:color w:val="000000"/>
-                <w:szCs w:val="24"/>
-              </w:rPr>
-              <w:t>Telefono</w:t>
+              <w:t>Rafael De Jesús Martínez Salazar</w:t>
             </w:r>
           </w:p>
         </w:tc>
@@ -617,7 +613,7 @@
                 <w:color w:val="000000"/>
                 <w:szCs w:val="24"/>
               </w:rPr>
-              <w:t>Carnet 1</w:t>
+              <w:t>MC20073</w:t>
             </w:r>
           </w:p>
         </w:tc>
@@ -650,75 +646,7 @@
                 <w:color w:val="000000"/>
                 <w:szCs w:val="24"/>
               </w:rPr>
-              <w:t>Nombre del integrante 1</w:t>
-            </w:r>
-          </w:p>
-        </w:tc>
-        <w:tc>
-          <w:tcPr>
-            <w:tcW w:w="0" w:type="auto"/>
-            <w:tcBorders>
-              <w:top w:val="nil"/>
-              <w:left w:val="nil"/>
-              <w:bottom w:val="single" w:sz="4" w:space="0" w:color="auto"/>
-              <w:right w:val="single" w:sz="4" w:space="0" w:color="auto"/>
-            </w:tcBorders>
-            <w:noWrap/>
-            <w:vAlign w:val="bottom"/>
-            <w:hideMark/>
-          </w:tcPr>
-          <w:p>
-            <w:pPr>
-              <w:spacing w:after="0" w:line="360" w:lineRule="auto"/>
-              <w:jc w:val="left"/>
-              <w:rPr>
-                <w:rFonts w:eastAsia="Times New Roman" w:cs="Arial"/>
-                <w:color w:val="000000"/>
-                <w:szCs w:val="24"/>
-              </w:rPr>
-            </w:pPr>
-            <w:hyperlink r:id="rId10" w:history="1">
-              <w:r>
-                <w:rPr>
-                  <w:rFonts w:eastAsia="Times New Roman" w:cs="Arial"/>
-                  <w:color w:val="000000"/>
-                  <w:szCs w:val="24"/>
-                </w:rPr>
-                <w:t>correo1@ues.edu.sv</w:t>
-              </w:r>
-            </w:hyperlink>
-          </w:p>
-        </w:tc>
-        <w:tc>
-          <w:tcPr>
-            <w:tcW w:w="0" w:type="auto"/>
-            <w:tcBorders>
-              <w:top w:val="nil"/>
-              <w:left w:val="nil"/>
-              <w:bottom w:val="single" w:sz="4" w:space="0" w:color="auto"/>
-              <w:right w:val="single" w:sz="4" w:space="0" w:color="auto"/>
-            </w:tcBorders>
-            <w:noWrap/>
-            <w:vAlign w:val="bottom"/>
-            <w:hideMark/>
-          </w:tcPr>
-          <w:p>
-            <w:pPr>
-              <w:spacing w:after="0" w:line="360" w:lineRule="auto"/>
-              <w:jc w:val="left"/>
-              <w:rPr>
-                <w:rFonts w:eastAsia="Times New Roman" w:cs="Arial"/>
-                <w:color w:val="000000"/>
-                <w:szCs w:val="24"/>
-              </w:rPr>
-            </w:pPr>
-            <w:r>
-              <w:rPr>
-                <w:rFonts w:eastAsia="Times New Roman" w:cs="Arial"/>
-                <w:color w:val="000000"/>
-                <w:szCs w:val="24"/>
-              </w:rPr>
-              <w:t>0000-0000</w:t>
+              <w:t>Mónica Rachell Mancía Contreras</w:t>
             </w:r>
           </w:p>
         </w:tc>
@@ -757,7 +685,7 @@
                 <w:color w:val="000000"/>
                 <w:szCs w:val="24"/>
               </w:rPr>
-              <w:t>Carnet 2</w:t>
+              <w:t>MG20066</w:t>
             </w:r>
           </w:p>
         </w:tc>
@@ -790,75 +718,7 @@
                 <w:color w:val="000000"/>
                 <w:szCs w:val="24"/>
               </w:rPr>
-              <w:t>Nombre del integrante 2</w:t>
-            </w:r>
-          </w:p>
-        </w:tc>
-        <w:tc>
-          <w:tcPr>
-            <w:tcW w:w="0" w:type="auto"/>
-            <w:tcBorders>
-              <w:top w:val="nil"/>
-              <w:left w:val="nil"/>
-              <w:bottom w:val="single" w:sz="4" w:space="0" w:color="auto"/>
-              <w:right w:val="single" w:sz="4" w:space="0" w:color="auto"/>
-            </w:tcBorders>
-            <w:noWrap/>
-            <w:vAlign w:val="bottom"/>
-            <w:hideMark/>
-          </w:tcPr>
-          <w:p>
-            <w:pPr>
-              <w:spacing w:after="0" w:line="360" w:lineRule="auto"/>
-              <w:jc w:val="left"/>
-              <w:rPr>
-                <w:rFonts w:eastAsia="Times New Roman" w:cs="Arial"/>
-                <w:color w:val="000000"/>
-                <w:szCs w:val="24"/>
-              </w:rPr>
-            </w:pPr>
-            <w:hyperlink r:id="rId11" w:history="1">
-              <w:r>
-                <w:rPr>
-                  <w:rFonts w:eastAsia="Times New Roman" w:cs="Arial"/>
-                  <w:color w:val="000000"/>
-                  <w:szCs w:val="24"/>
-                </w:rPr>
-                <w:t>correo2@ues.edu.sv</w:t>
-              </w:r>
-            </w:hyperlink>
-          </w:p>
-        </w:tc>
-        <w:tc>
-          <w:tcPr>
-            <w:tcW w:w="0" w:type="auto"/>
-            <w:tcBorders>
-              <w:top w:val="nil"/>
-              <w:left w:val="nil"/>
-              <w:bottom w:val="single" w:sz="4" w:space="0" w:color="auto"/>
-              <w:right w:val="single" w:sz="4" w:space="0" w:color="auto"/>
-            </w:tcBorders>
-            <w:noWrap/>
-            <w:vAlign w:val="bottom"/>
-            <w:hideMark/>
-          </w:tcPr>
-          <w:p>
-            <w:pPr>
-              <w:spacing w:after="0" w:line="360" w:lineRule="auto"/>
-              <w:jc w:val="left"/>
-              <w:rPr>
-                <w:rFonts w:eastAsia="Times New Roman" w:cs="Arial"/>
-                <w:color w:val="000000"/>
-                <w:szCs w:val="24"/>
-              </w:rPr>
-            </w:pPr>
-            <w:r>
-              <w:rPr>
-                <w:rFonts w:eastAsia="Times New Roman" w:cs="Arial"/>
-                <w:color w:val="000000"/>
-                <w:szCs w:val="24"/>
-              </w:rPr>
-              <w:t>0000-0000</w:t>
+              <w:t>Manuel Bernardo Mendoza Garcia</w:t>
             </w:r>
           </w:p>
         </w:tc>
@@ -897,7 +757,7 @@
                 <w:color w:val="000000"/>
                 <w:szCs w:val="24"/>
               </w:rPr>
-              <w:t>Carnet 3</w:t>
+              <w:t>LR20047</w:t>
             </w:r>
           </w:p>
         </w:tc>
@@ -930,75 +790,7 @@
                 <w:color w:val="000000"/>
                 <w:szCs w:val="24"/>
               </w:rPr>
-              <w:t>Nombre del integrante 3</w:t>
-            </w:r>
-          </w:p>
-        </w:tc>
-        <w:tc>
-          <w:tcPr>
-            <w:tcW w:w="0" w:type="auto"/>
-            <w:tcBorders>
-              <w:top w:val="nil"/>
-              <w:left w:val="nil"/>
-              <w:bottom w:val="single" w:sz="4" w:space="0" w:color="auto"/>
-              <w:right w:val="single" w:sz="4" w:space="0" w:color="auto"/>
-            </w:tcBorders>
-            <w:noWrap/>
-            <w:vAlign w:val="bottom"/>
-            <w:hideMark/>
-          </w:tcPr>
-          <w:p>
-            <w:pPr>
-              <w:spacing w:after="0" w:line="360" w:lineRule="auto"/>
-              <w:jc w:val="left"/>
-              <w:rPr>
-                <w:rFonts w:eastAsia="Times New Roman" w:cs="Arial"/>
-                <w:color w:val="000000"/>
-                <w:szCs w:val="24"/>
-              </w:rPr>
-            </w:pPr>
-            <w:hyperlink r:id="rId12" w:history="1">
-              <w:r>
-                <w:rPr>
-                  <w:rFonts w:eastAsia="Times New Roman" w:cs="Arial"/>
-                  <w:color w:val="000000"/>
-                  <w:szCs w:val="24"/>
-                </w:rPr>
-                <w:t>correo3@ues.edu.sv</w:t>
-              </w:r>
-            </w:hyperlink>
-          </w:p>
-        </w:tc>
-        <w:tc>
-          <w:tcPr>
-            <w:tcW w:w="0" w:type="auto"/>
-            <w:tcBorders>
-              <w:top w:val="nil"/>
-              <w:left w:val="nil"/>
-              <w:bottom w:val="single" w:sz="4" w:space="0" w:color="auto"/>
-              <w:right w:val="single" w:sz="4" w:space="0" w:color="auto"/>
-            </w:tcBorders>
-            <w:noWrap/>
-            <w:vAlign w:val="bottom"/>
-            <w:hideMark/>
-          </w:tcPr>
-          <w:p>
-            <w:pPr>
-              <w:spacing w:after="0" w:line="360" w:lineRule="auto"/>
-              <w:jc w:val="left"/>
-              <w:rPr>
-                <w:rFonts w:eastAsia="Times New Roman" w:cs="Arial"/>
-                <w:color w:val="000000"/>
-                <w:szCs w:val="24"/>
-              </w:rPr>
-            </w:pPr>
-            <w:r>
-              <w:rPr>
-                <w:rFonts w:eastAsia="Times New Roman" w:cs="Arial"/>
-                <w:color w:val="000000"/>
-                <w:szCs w:val="24"/>
-              </w:rPr>
-              <w:t>0000-0000</w:t>
+              <w:t>Osmin Eli Lorenzana Rodriguez</w:t>
             </w:r>
           </w:p>
         </w:tc>
@@ -1037,7 +829,7 @@
                 <w:color w:val="000000"/>
                 <w:szCs w:val="24"/>
               </w:rPr>
-              <w:t>Carnet 4</w:t>
+              <w:t>MS20020</w:t>
             </w:r>
           </w:p>
         </w:tc>
@@ -1070,213 +862,7 @@
                 <w:color w:val="000000"/>
                 <w:szCs w:val="24"/>
               </w:rPr>
-              <w:t>Nombre del integrante 4</w:t>
-            </w:r>
-          </w:p>
-        </w:tc>
-        <w:tc>
-          <w:tcPr>
-            <w:tcW w:w="0" w:type="auto"/>
-            <w:tcBorders>
-              <w:top w:val="nil"/>
-              <w:left w:val="nil"/>
-              <w:bottom w:val="single" w:sz="4" w:space="0" w:color="auto"/>
-              <w:right w:val="single" w:sz="4" w:space="0" w:color="auto"/>
-            </w:tcBorders>
-            <w:noWrap/>
-            <w:vAlign w:val="bottom"/>
-            <w:hideMark/>
-          </w:tcPr>
-          <w:p>
-            <w:pPr>
-              <w:spacing w:after="0" w:line="360" w:lineRule="auto"/>
-              <w:jc w:val="left"/>
-              <w:rPr>
-                <w:rFonts w:eastAsia="Times New Roman" w:cs="Arial"/>
-                <w:color w:val="000000"/>
-                <w:szCs w:val="24"/>
-              </w:rPr>
-            </w:pPr>
-            <w:hyperlink r:id="rId13" w:history="1">
-              <w:r>
-                <w:rPr>
-                  <w:rFonts w:eastAsia="Times New Roman" w:cs="Arial"/>
-                  <w:color w:val="000000"/>
-                  <w:szCs w:val="24"/>
-                </w:rPr>
-                <w:t>correo4@ues.edu.sv</w:t>
-              </w:r>
-            </w:hyperlink>
-          </w:p>
-        </w:tc>
-        <w:tc>
-          <w:tcPr>
-            <w:tcW w:w="0" w:type="auto"/>
-            <w:tcBorders>
-              <w:top w:val="nil"/>
-              <w:left w:val="nil"/>
-              <w:bottom w:val="single" w:sz="4" w:space="0" w:color="auto"/>
-              <w:right w:val="single" w:sz="4" w:space="0" w:color="auto"/>
-            </w:tcBorders>
-            <w:noWrap/>
-            <w:vAlign w:val="bottom"/>
-            <w:hideMark/>
-          </w:tcPr>
-          <w:p>
-            <w:pPr>
-              <w:spacing w:after="0" w:line="360" w:lineRule="auto"/>
-              <w:jc w:val="left"/>
-              <w:rPr>
-                <w:rFonts w:eastAsia="Times New Roman" w:cs="Arial"/>
-                <w:color w:val="000000"/>
-                <w:szCs w:val="24"/>
-              </w:rPr>
-            </w:pPr>
-            <w:r>
-              <w:rPr>
-                <w:rFonts w:eastAsia="Times New Roman" w:cs="Arial"/>
-                <w:color w:val="000000"/>
-                <w:szCs w:val="24"/>
-              </w:rPr>
-              <w:t>0000-0000</w:t>
-            </w:r>
-          </w:p>
-        </w:tc>
-      </w:tr>
-      <w:tr>
-        <w:trPr>
-          <w:trHeight w:val="353"/>
-          <w:jc w:val="center"/>
-        </w:trPr>
-        <w:tc>
-          <w:tcPr>
-            <w:tcW w:w="0" w:type="auto"/>
-            <w:tcBorders>
-              <w:top w:val="nil"/>
-              <w:left w:val="single" w:sz="4" w:space="0" w:color="auto"/>
-              <w:bottom w:val="single" w:sz="4" w:space="0" w:color="auto"/>
-              <w:right w:val="single" w:sz="4" w:space="0" w:color="auto"/>
-            </w:tcBorders>
-            <w:noWrap/>
-            <w:vAlign w:val="bottom"/>
-            <w:hideMark/>
-          </w:tcPr>
-          <w:p>
-            <w:pPr>
-              <w:spacing w:after="0" w:line="360" w:lineRule="auto"/>
-              <w:jc w:val="left"/>
-              <w:rPr>
-                <w:rFonts w:eastAsia="Times New Roman" w:cs="Arial"/>
-                <w:color w:val="000000"/>
-                <w:szCs w:val="24"/>
-              </w:rPr>
-            </w:pPr>
-            <w:r>
-              <w:rPr>
-                <w:rFonts w:eastAsia="Times New Roman" w:cs="Arial"/>
-                <w:color w:val="000000"/>
-                <w:szCs w:val="24"/>
-              </w:rPr>
-              <w:t>Carnet 5</w:t>
-            </w:r>
-          </w:p>
-        </w:tc>
-        <w:tc>
-          <w:tcPr>
-            <w:tcW w:w="0" w:type="auto"/>
-            <w:tcBorders>
-              <w:top w:val="nil"/>
-              <w:left w:val="nil"/>
-              <w:bottom w:val="single" w:sz="4" w:space="0" w:color="auto"/>
-              <w:right w:val="single" w:sz="4" w:space="0" w:color="auto"/>
-            </w:tcBorders>
-            <w:noWrap/>
-            <w:vAlign w:val="bottom"/>
-            <w:hideMark/>
-          </w:tcPr>
-          <w:p>
-            <w:pPr>
-              <w:spacing w:after="0" w:line="360" w:lineRule="auto"/>
-              <w:jc w:val="left"/>
-              <w:rPr>
-                <w:rFonts w:eastAsia="Times New Roman" w:cs="Arial"/>
-                <w:color w:val="000000"/>
-                <w:szCs w:val="24"/>
-              </w:rPr>
-            </w:pPr>
-            <w:r>
-              <w:rPr>
-                <w:rFonts w:eastAsia="Times New Roman" w:cs="Arial"/>
-                <w:color w:val="000000"/>
-                <w:szCs w:val="24"/>
-              </w:rPr>
-              <w:t>Nombre del integrante 5</w:t>
-            </w:r>
-          </w:p>
-        </w:tc>
-        <w:tc>
-          <w:tcPr>
-            <w:tcW w:w="0" w:type="auto"/>
-            <w:tcBorders>
-              <w:top w:val="nil"/>
-              <w:left w:val="nil"/>
-              <w:bottom w:val="single" w:sz="4" w:space="0" w:color="auto"/>
-              <w:right w:val="single" w:sz="4" w:space="0" w:color="auto"/>
-            </w:tcBorders>
-            <w:noWrap/>
-            <w:vAlign w:val="bottom"/>
-            <w:hideMark/>
-          </w:tcPr>
-          <w:p>
-            <w:pPr>
-              <w:spacing w:after="0" w:line="360" w:lineRule="auto"/>
-              <w:jc w:val="left"/>
-              <w:rPr>
-                <w:rFonts w:eastAsia="Times New Roman" w:cs="Arial"/>
-                <w:color w:val="000000"/>
-                <w:szCs w:val="24"/>
-              </w:rPr>
-            </w:pPr>
-            <w:r>
-              <w:rPr>
-                <w:rFonts w:eastAsia="Times New Roman" w:cs="Arial"/>
-                <w:color w:val="000000"/>
-                <w:szCs w:val="24"/>
-              </w:rPr>
-              <w:t>correo5@ues.edu.sv</w:t>
-            </w:r>
-          </w:p>
-        </w:tc>
-        <w:tc>
-          <w:tcPr>
-            <w:tcW w:w="0" w:type="auto"/>
-            <w:tcBorders>
-              <w:top w:val="nil"/>
-              <w:left w:val="nil"/>
-              <w:bottom w:val="single" w:sz="4" w:space="0" w:color="auto"/>
-              <w:right w:val="single" w:sz="4" w:space="0" w:color="auto"/>
-            </w:tcBorders>
-            <w:noWrap/>
-            <w:vAlign w:val="bottom"/>
-            <w:hideMark/>
-          </w:tcPr>
-          <w:p>
-            <w:pPr>
-              <w:spacing w:after="0" w:line="360" w:lineRule="auto"/>
-              <w:jc w:val="left"/>
-              <w:rPr>
-                <w:rFonts w:eastAsia="Times New Roman" w:cs="Arial"/>
-                <w:color w:val="000000"/>
-                <w:szCs w:val="24"/>
-              </w:rPr>
-            </w:pPr>
-            <w:r>
-              <w:rPr>
-                <w:rFonts w:eastAsia="Times New Roman" w:cs="Arial"/>
-                <w:color w:val="000000"/>
-                <w:szCs w:val="24"/>
-              </w:rPr>
-              <w:t>0000-0000</w:t>
+              <w:t>Liliana Giselle Márquez Sánchez</w:t>
             </w:r>
           </w:p>
         </w:tc>

</xml_diff>

<commit_message>
Dejar solo mes y año en la fecha de la portada del amigo
Co-Authored-By: Claude Opus 5.5 <noreply@anthropic.com>
Claude-Session: https://claude.ai/code/session_01MPxHATC7J23odgNHR4pRGu
</commit_message>
<xml_diff>
--- a/Portada_Amigo_Delimitada.docx
+++ b/Portada_Amigo_Delimitada.docx
@@ -966,7 +966,7 @@
           <w:szCs w:val="24"/>
           <w:lang w:val="es-ES"/>
         </w:rPr>
-        <w:t>Jueves, 01</w:t>
+        <w:t>Octubre</w:t>
       </w:r>
       <w:r>
         <w:rPr>
@@ -974,7 +974,7 @@
           <w:szCs w:val="24"/>
           <w:lang w:val="es-ES"/>
         </w:rPr>
-        <w:t xml:space="preserve"> de </w:t>
+        <w:t xml:space="preserve"/>
       </w:r>
       <w:r>
         <w:rPr>
@@ -982,7 +982,7 @@
           <w:szCs w:val="24"/>
           <w:lang w:val="es-ES"/>
         </w:rPr>
-        <w:t>octubre</w:t>
+        <w:t/>
       </w:r>
       <w:r>
         <w:rPr>

</xml_diff>